<commit_message>
Update docx file with latest changes
</commit_message>
<xml_diff>
--- a/topic1/TP-KB-252-Vlad-Baklazhko/TP-KB-252-Vlad-Baklazhko-lpr.docx
+++ b/topic1/TP-KB-252-Vlad-Baklazhko/TP-KB-252-Vlad-Baklazhko-lpr.docx
@@ -1555,12 +1555,13 @@
       <w:r>
         <w:rPr>
           <w:rFonts w:cs="Times New Roman"/>
+          <w:noProof/>
           <w:szCs w:val="28"/>
         </w:rPr>
         <w:drawing>
-          <wp:inline distT="0" distB="0" distL="0" distR="0" wp14:anchorId="5BFA8CE0" wp14:editId="35FB6377">
-            <wp:extent cx="5943600" cy="594995"/>
-            <wp:effectExtent l="0" t="0" r="0" b="0"/>
+          <wp:inline distT="0" distB="0" distL="0" distR="0" wp14:anchorId="5BFA8CE0" wp14:editId="275CE792">
+            <wp:extent cx="5463540" cy="546938"/>
+            <wp:effectExtent l="0" t="0" r="3810" b="5715"/>
             <wp:docPr id="14997519" name="Рисунок 1"/>
             <wp:cNvGraphicFramePr>
               <a:graphicFrameLocks xmlns:a="http://schemas.openxmlformats.org/drawingml/2006/main" noChangeAspect="1"/>
@@ -1573,7 +1574,7 @@
                     <pic:cNvPicPr/>
                   </pic:nvPicPr>
                   <pic:blipFill>
-                    <a:blip r:embed="rId4"/>
+                    <a:blip r:embed="rId6"/>
                     <a:stretch>
                       <a:fillRect/>
                     </a:stretch>
@@ -1581,7 +1582,7 @@
                   <pic:spPr>
                     <a:xfrm>
                       <a:off x="0" y="0"/>
-                      <a:ext cx="5943600" cy="594995"/>
+                      <a:ext cx="5472004" cy="547785"/>
                     </a:xfrm>
                     <a:prstGeom prst="rect">
                       <a:avLst/>
@@ -1638,13 +1639,14 @@
     </w:p>
     <w:p>
       <w:pPr>
+        <w:ind w:left="720" w:firstLine="0"/>
         <w:rPr>
           <w:rFonts w:cs="Times New Roman"/>
           <w:szCs w:val="28"/>
           <w:lang w:val="ru-RU"/>
         </w:rPr>
       </w:pPr>
-      <w:hyperlink r:id="rId5" w:history="1">
+      <w:hyperlink r:id="rId7" w:history="1">
         <w:r>
           <w:rPr>
             <w:rStyle w:val="a4"/>
@@ -1954,6 +1956,7 @@
       <w:r>
         <w:rPr>
           <w:rFonts w:cs="Times New Roman"/>
+          <w:noProof/>
           <w:szCs w:val="28"/>
           <w:lang w:val="ru-RU"/>
         </w:rPr>
@@ -1973,7 +1976,7 @@
                     <pic:cNvPicPr/>
                   </pic:nvPicPr>
                   <pic:blipFill>
-                    <a:blip r:embed="rId6"/>
+                    <a:blip r:embed="rId8"/>
                     <a:stretch>
                       <a:fillRect/>
                     </a:stretch>
@@ -1993,6 +1996,15 @@
           </wp:inline>
         </w:drawing>
       </w:r>
+    </w:p>
+    <w:p>
+      <w:pPr>
+        <w:rPr>
+          <w:rFonts w:cs="Times New Roman"/>
+          <w:szCs w:val="28"/>
+          <w:lang w:val="ru-RU"/>
+        </w:rPr>
+      </w:pPr>
     </w:p>
     <w:p>
       <w:pPr>
@@ -3594,6 +3606,8 @@
       <w:pPr>
         <w:rPr>
           <w:rFonts w:cs="Times New Roman"/>
+          <w:b/>
+          <w:bCs/>
           <w:szCs w:val="28"/>
         </w:rPr>
       </w:pPr>
@@ -3601,6 +3615,8 @@
       <w:r>
         <w:rPr>
           <w:rFonts w:cs="Times New Roman"/>
+          <w:b/>
+          <w:bCs/>
           <w:szCs w:val="28"/>
         </w:rPr>
         <w:lastRenderedPageBreak/>
@@ -3610,14 +3626,18 @@
       <w:r>
         <w:rPr>
           <w:rFonts w:cs="Times New Roman"/>
-          <w:szCs w:val="28"/>
-        </w:rPr>
-        <w:t xml:space="preserve"> </w:t>
-      </w:r>
-      <w:proofErr w:type="spellStart"/>
-      <w:r>
-        <w:rPr>
-          <w:rFonts w:cs="Times New Roman"/>
+          <w:b/>
+          <w:bCs/>
+          <w:szCs w:val="28"/>
+        </w:rPr>
+        <w:t xml:space="preserve"> </w:t>
+      </w:r>
+      <w:proofErr w:type="spellStart"/>
+      <w:r>
+        <w:rPr>
+          <w:rFonts w:cs="Times New Roman"/>
+          <w:b/>
+          <w:bCs/>
           <w:szCs w:val="28"/>
         </w:rPr>
         <w:t>виконання</w:t>
@@ -3626,6 +3646,8 @@
       <w:r>
         <w:rPr>
           <w:rFonts w:cs="Times New Roman"/>
+          <w:b/>
+          <w:bCs/>
           <w:szCs w:val="28"/>
         </w:rPr>
         <w:t>:</w:t>
@@ -3641,6 +3663,7 @@
       <w:r>
         <w:rPr>
           <w:rFonts w:cs="Times New Roman"/>
+          <w:noProof/>
           <w:szCs w:val="28"/>
         </w:rPr>
         <w:drawing>
@@ -3659,7 +3682,7 @@
                     <pic:cNvPicPr/>
                   </pic:nvPicPr>
                   <pic:blipFill>
-                    <a:blip r:embed="rId7"/>
+                    <a:blip r:embed="rId9"/>
                     <a:stretch>
                       <a:fillRect/>
                     </a:stretch>
@@ -3684,6 +3707,8 @@
       <w:pPr>
         <w:rPr>
           <w:rFonts w:cs="Times New Roman"/>
+          <w:b/>
+          <w:bCs/>
           <w:szCs w:val="28"/>
           <w:lang w:val="ru-RU"/>
         </w:rPr>
@@ -3692,6 +3717,8 @@
       <w:r>
         <w:rPr>
           <w:rFonts w:cs="Times New Roman"/>
+          <w:b/>
+          <w:bCs/>
           <w:szCs w:val="28"/>
           <w:lang w:val="ru-RU"/>
         </w:rPr>
@@ -3701,6 +3728,8 @@
       <w:r>
         <w:rPr>
           <w:rFonts w:cs="Times New Roman"/>
+          <w:b/>
+          <w:bCs/>
           <w:szCs w:val="28"/>
           <w:lang w:val="ru-RU"/>
         </w:rPr>
@@ -3709,6 +3738,8 @@
       <w:r>
         <w:rPr>
           <w:rFonts w:cs="Times New Roman"/>
+          <w:b/>
+          <w:bCs/>
           <w:szCs w:val="28"/>
         </w:rPr>
         <w:t>GitHub</w:t>
@@ -3716,6 +3747,8 @@
       <w:r>
         <w:rPr>
           <w:rFonts w:cs="Times New Roman"/>
+          <w:b/>
+          <w:bCs/>
           <w:szCs w:val="28"/>
           <w:lang w:val="ru-RU"/>
         </w:rPr>
@@ -3727,9 +3760,10 @@
         <w:rPr>
           <w:rFonts w:cs="Times New Roman"/>
           <w:szCs w:val="28"/>
+          <w:lang w:val="ru-RU"/>
         </w:rPr>
       </w:pPr>
-      <w:hyperlink r:id="rId8" w:history="1">
+      <w:hyperlink r:id="rId10" w:history="1">
         <w:r>
           <w:rPr>
             <w:rStyle w:val="a4"/>
@@ -4038,6 +4072,7 @@
       <w:r>
         <w:rPr>
           <w:rFonts w:cs="Times New Roman"/>
+          <w:noProof/>
           <w:szCs w:val="28"/>
         </w:rPr>
         <w:drawing>
@@ -4056,7 +4091,7 @@
                     <pic:cNvPicPr/>
                   </pic:nvPicPr>
                   <pic:blipFill>
-                    <a:blip r:embed="rId9"/>
+                    <a:blip r:embed="rId11"/>
                     <a:stretch>
                       <a:fillRect/>
                     </a:stretch>
@@ -4326,6 +4361,7 @@
         <w:rPr>
           <w:rFonts w:cs="Times New Roman"/>
           <w:szCs w:val="28"/>
+          <w:lang w:val="ru-RU"/>
         </w:rPr>
       </w:pPr>
       <w:proofErr w:type="spellStart"/>
@@ -4597,10 +4633,21 @@
           <w:szCs w:val="28"/>
           <w:lang w:val="ru-RU"/>
         </w:rPr>
-        <w:t xml:space="preserve"> (</w:t>
+        <w:t xml:space="preserve"> </w:t>
+      </w:r>
+      <w:r>
+        <w:rPr>
+          <w:rFonts w:cs="Times New Roman"/>
+          <w:szCs w:val="28"/>
+          <w:lang w:val="ru-RU"/>
+        </w:rPr>
+        <w:t>(</w:t>
       </w:r>
       <m:oMath>
         <m:r>
+          <m:rPr>
+            <m:sty m:val="p"/>
+          </m:rPr>
           <w:rPr>
             <w:rFonts w:ascii="Cambria Math" w:hAnsi="Cambria Math" w:cs="Times New Roman"/>
             <w:szCs w:val="28"/>
@@ -4620,6 +4667,9 @@
           </m:sSupPr>
           <m:e>
             <m:r>
+              <m:rPr>
+                <m:sty m:val="p"/>
+              </m:rPr>
               <w:rPr>
                 <w:rFonts w:ascii="Cambria Math" w:hAnsi="Cambria Math" w:cs="Times New Roman"/>
                 <w:szCs w:val="28"/>
@@ -4630,6 +4680,9 @@
           </m:e>
           <m:sup>
             <m:r>
+              <m:rPr>
+                <m:sty m:val="p"/>
+              </m:rPr>
               <w:rPr>
                 <w:rFonts w:ascii="Cambria Math" w:hAnsi="Cambria Math" w:cs="Times New Roman"/>
                 <w:szCs w:val="28"/>
@@ -4640,6 +4693,9 @@
           </m:sup>
         </m:sSup>
         <m:r>
+          <m:rPr>
+            <m:sty m:val="p"/>
+          </m:rPr>
           <w:rPr>
             <w:rFonts w:ascii="Cambria Math" w:hAnsi="Cambria Math" w:cs="Times New Roman"/>
             <w:szCs w:val="28"/>
@@ -4654,7 +4710,51 @@
           <w:szCs w:val="28"/>
           <w:lang w:val="ru-RU"/>
         </w:rPr>
-        <w:t xml:space="preserve">). Коефіцієнти вводяться користувачем з клавіатури та перетворюються у числа з плаваючою комою, після чого результат </w:t>
+        <w:t>).</w:t>
+      </w:r>
+      <w:r>
+        <w:rPr>
+          <w:rFonts w:cs="Times New Roman"/>
+          <w:szCs w:val="28"/>
+          <w:lang w:val="ru-RU"/>
+        </w:rPr>
+        <w:t xml:space="preserve"> Коефіцієнти вводяться користувачем з клавіатури та перетворюються у числа з плаваючою комою, </w:t>
+      </w:r>
+      <w:proofErr w:type="spellStart"/>
+      <w:r>
+        <w:rPr>
+          <w:rFonts w:cs="Times New Roman"/>
+          <w:szCs w:val="28"/>
+          <w:lang w:val="ru-RU"/>
+        </w:rPr>
+        <w:t>після</w:t>
+      </w:r>
+      <w:proofErr w:type="spellEnd"/>
+      <w:r>
+        <w:rPr>
+          <w:rFonts w:cs="Times New Roman"/>
+          <w:szCs w:val="28"/>
+          <w:lang w:val="ru-RU"/>
+        </w:rPr>
+        <w:t xml:space="preserve"> </w:t>
+      </w:r>
+      <w:proofErr w:type="spellStart"/>
+      <w:r>
+        <w:rPr>
+          <w:rFonts w:cs="Times New Roman"/>
+          <w:szCs w:val="28"/>
+          <w:lang w:val="ru-RU"/>
+        </w:rPr>
+        <w:t>чого</w:t>
+      </w:r>
+      <w:proofErr w:type="spellEnd"/>
+      <w:r>
+        <w:rPr>
+          <w:rFonts w:cs="Times New Roman"/>
+          <w:szCs w:val="28"/>
+          <w:lang w:val="ru-RU"/>
+        </w:rPr>
+        <w:t xml:space="preserve"> результат </w:t>
       </w:r>
       <w:proofErr w:type="spellStart"/>
       <w:r>
@@ -4716,6 +4816,7 @@
         <w:rPr>
           <w:rFonts w:cs="Times New Roman"/>
           <w:szCs w:val="28"/>
+          <w:lang w:val="ru-RU"/>
         </w:rPr>
       </w:pPr>
     </w:p>
@@ -4723,6 +4824,8 @@
       <w:pPr>
         <w:rPr>
           <w:rFonts w:cs="Times New Roman"/>
+          <w:b/>
+          <w:bCs/>
           <w:szCs w:val="28"/>
         </w:rPr>
       </w:pPr>
@@ -4730,6 +4833,8 @@
       <w:r>
         <w:rPr>
           <w:rFonts w:cs="Times New Roman"/>
+          <w:b/>
+          <w:bCs/>
           <w:szCs w:val="28"/>
         </w:rPr>
         <w:t>Текст</w:t>
@@ -4738,14 +4843,18 @@
       <w:r>
         <w:rPr>
           <w:rFonts w:cs="Times New Roman"/>
-          <w:szCs w:val="28"/>
-        </w:rPr>
-        <w:t xml:space="preserve"> </w:t>
-      </w:r>
-      <w:proofErr w:type="spellStart"/>
-      <w:r>
-        <w:rPr>
-          <w:rFonts w:cs="Times New Roman"/>
+          <w:b/>
+          <w:bCs/>
+          <w:szCs w:val="28"/>
+        </w:rPr>
+        <w:t xml:space="preserve"> </w:t>
+      </w:r>
+      <w:proofErr w:type="spellStart"/>
+      <w:r>
+        <w:rPr>
+          <w:rFonts w:cs="Times New Roman"/>
+          <w:b/>
+          <w:bCs/>
           <w:szCs w:val="28"/>
         </w:rPr>
         <w:t>програми</w:t>
@@ -4754,6 +4863,8 @@
       <w:r>
         <w:rPr>
           <w:rFonts w:cs="Times New Roman"/>
+          <w:b/>
+          <w:bCs/>
           <w:szCs w:val="28"/>
         </w:rPr>
         <w:t xml:space="preserve">: </w:t>
@@ -5288,6 +5399,8 @@
       <w:pPr>
         <w:rPr>
           <w:rFonts w:cs="Times New Roman"/>
+          <w:b/>
+          <w:bCs/>
           <w:szCs w:val="28"/>
         </w:rPr>
       </w:pPr>
@@ -5295,6 +5408,8 @@
       <w:r>
         <w:rPr>
           <w:rFonts w:cs="Times New Roman"/>
+          <w:b/>
+          <w:bCs/>
           <w:szCs w:val="28"/>
         </w:rPr>
         <w:t>Результат</w:t>
@@ -5303,14 +5418,18 @@
       <w:r>
         <w:rPr>
           <w:rFonts w:cs="Times New Roman"/>
-          <w:szCs w:val="28"/>
-        </w:rPr>
-        <w:t xml:space="preserve"> </w:t>
-      </w:r>
-      <w:proofErr w:type="spellStart"/>
-      <w:r>
-        <w:rPr>
-          <w:rFonts w:cs="Times New Roman"/>
+          <w:b/>
+          <w:bCs/>
+          <w:szCs w:val="28"/>
+        </w:rPr>
+        <w:t xml:space="preserve"> </w:t>
+      </w:r>
+      <w:proofErr w:type="spellStart"/>
+      <w:r>
+        <w:rPr>
+          <w:rFonts w:cs="Times New Roman"/>
+          <w:b/>
+          <w:bCs/>
           <w:szCs w:val="28"/>
         </w:rPr>
         <w:t>виконання</w:t>
@@ -5319,6 +5438,8 @@
       <w:r>
         <w:rPr>
           <w:rFonts w:cs="Times New Roman"/>
+          <w:b/>
+          <w:bCs/>
           <w:szCs w:val="28"/>
         </w:rPr>
         <w:t>:</w:t>
@@ -5334,6 +5455,7 @@
       <w:r>
         <w:rPr>
           <w:rFonts w:cs="Times New Roman"/>
+          <w:noProof/>
           <w:szCs w:val="28"/>
         </w:rPr>
         <w:drawing>
@@ -5352,7 +5474,7 @@
                     <pic:cNvPicPr/>
                   </pic:nvPicPr>
                   <pic:blipFill>
-                    <a:blip r:embed="rId10"/>
+                    <a:blip r:embed="rId12"/>
                     <a:stretch>
                       <a:fillRect/>
                     </a:stretch>
@@ -5377,6 +5499,8 @@
       <w:pPr>
         <w:rPr>
           <w:rFonts w:cs="Times New Roman"/>
+          <w:b/>
+          <w:bCs/>
           <w:szCs w:val="28"/>
           <w:lang w:val="ru-RU"/>
         </w:rPr>
@@ -5385,6 +5509,8 @@
       <w:r>
         <w:rPr>
           <w:rFonts w:cs="Times New Roman"/>
+          <w:b/>
+          <w:bCs/>
           <w:szCs w:val="28"/>
           <w:lang w:val="ru-RU"/>
         </w:rPr>
@@ -5394,6 +5520,8 @@
       <w:r>
         <w:rPr>
           <w:rFonts w:cs="Times New Roman"/>
+          <w:b/>
+          <w:bCs/>
           <w:szCs w:val="28"/>
           <w:lang w:val="ru-RU"/>
         </w:rPr>
@@ -5402,6 +5530,8 @@
       <w:r>
         <w:rPr>
           <w:rFonts w:cs="Times New Roman"/>
+          <w:b/>
+          <w:bCs/>
           <w:szCs w:val="28"/>
         </w:rPr>
         <w:t>GitHub</w:t>
@@ -5409,6 +5539,8 @@
       <w:r>
         <w:rPr>
           <w:rFonts w:cs="Times New Roman"/>
+          <w:b/>
+          <w:bCs/>
           <w:szCs w:val="28"/>
           <w:lang w:val="ru-RU"/>
         </w:rPr>
@@ -5420,9 +5552,10 @@
         <w:rPr>
           <w:rFonts w:cs="Times New Roman"/>
           <w:szCs w:val="28"/>
+          <w:lang w:val="ru-RU"/>
         </w:rPr>
       </w:pPr>
-      <w:hyperlink r:id="rId11" w:history="1">
+      <w:hyperlink r:id="rId13" w:history="1">
         <w:r>
           <w:rPr>
             <w:rStyle w:val="a4"/>
@@ -5648,6 +5781,7 @@
         <w:rPr>
           <w:rFonts w:cs="Times New Roman"/>
           <w:szCs w:val="28"/>
+          <w:lang w:val="ru-RU"/>
         </w:rPr>
       </w:pPr>
     </w:p>
@@ -5741,6 +5875,7 @@
       <w:r>
         <w:rPr>
           <w:rFonts w:cs="Times New Roman"/>
+          <w:noProof/>
           <w:szCs w:val="28"/>
           <w:lang w:val="uk-UA"/>
         </w:rPr>
@@ -5760,7 +5895,7 @@
                     <pic:cNvPicPr/>
                   </pic:nvPicPr>
                   <pic:blipFill>
-                    <a:blip r:embed="rId12"/>
+                    <a:blip r:embed="rId14"/>
                     <a:stretch>
                       <a:fillRect/>
                     </a:stretch>
@@ -6175,6 +6310,56 @@
     </w:sectPr>
   </w:body>
 </w:document>
+</file>
+
+<file path=word/endnotes.xml><?xml version="1.0" encoding="utf-8"?>
+<w:endnotes xmlns:wpc="http://schemas.microsoft.com/office/word/2010/wordprocessingCanvas" xmlns:cx="http://schemas.microsoft.com/office/drawing/2014/chartex" xmlns:cx1="http://schemas.microsoft.com/office/drawing/2015/9/8/chartex" xmlns:cx2="http://schemas.microsoft.com/office/drawing/2015/10/21/chartex" xmlns:cx3="http://schemas.microsoft.com/office/drawing/2016/5/9/chartex" xmlns:cx4="http://schemas.microsoft.com/office/drawing/2016/5/10/chartex" xmlns:cx5="http://schemas.microsoft.com/office/drawing/2016/5/11/chartex" xmlns:cx6="http://schemas.microsoft.com/office/drawing/2016/5/12/chartex" xmlns:cx7="http://schemas.microsoft.com/office/drawing/2016/5/13/chartex" xmlns:cx8="http://schemas.microsoft.com/office/drawing/2016/5/14/chartex" xmlns:mc="http://schemas.openxmlformats.org/markup-compatibility/2006" xmlns:aink="http://schemas.microsoft.com/office/drawing/2016/ink" xmlns:am3d="http://schemas.microsoft.com/office/drawing/2017/model3d" xmlns:o="urn:schemas-microsoft-com:office:office" xmlns:oel="http://schemas.microsoft.com/office/2019/extlst" xmlns:r="http://schemas.openxmlformats.org/officeDocument/2006/relationships" xmlns:m="http://schemas.openxmlformats.org/officeDocument/2006/math" xmlns:v="urn:schemas-microsoft-com:vml" xmlns:wp14="http://schemas.microsoft.com/office/word/2010/wordprocessingDrawing" xmlns:wp="http://schemas.openxmlformats.org/drawingml/2006/wordprocessingDrawing" xmlns:w10="urn:schemas-microsoft-com:office:word" xmlns:w="http://schemas.openxmlformats.org/wordprocessingml/2006/main" xmlns:w14="http://schemas.microsoft.com/office/word/2010/wordml" xmlns:w15="http://schemas.microsoft.com/office/word/2012/wordml" xmlns:w16cex="http://schemas.microsoft.com/office/word/2018/wordml/cex" xmlns:w16cid="http://schemas.microsoft.com/office/word/2016/wordml/cid" xmlns:w16="http://schemas.microsoft.com/office/word/2018/wordml" xmlns:w16du="http://schemas.microsoft.com/office/word/2023/wordml/word16du" xmlns:w16sdtdh="http://schemas.microsoft.com/office/word/2020/wordml/sdtdatahash" xmlns:w16sdtfl="http://schemas.microsoft.com/office/word/2024/wordml/sdtformatlock" xmlns:w16se="http://schemas.microsoft.com/office/word/2015/wordml/symex" xmlns:wpg="http://schemas.microsoft.com/office/word/2010/wordprocessingGroup" xmlns:wpi="http://schemas.microsoft.com/office/word/2010/wordprocessingInk" xmlns:wne="http://schemas.microsoft.com/office/word/2006/wordml" xmlns:wps="http://schemas.microsoft.com/office/word/2010/wordprocessingShape" mc:Ignorable="w14 w15 w16se w16cid w16 w16cex w16sdtdh w16sdtfl w16du wp14">
+  <w:endnote w:type="separator" w:id="-1">
+    <w:p>
+      <w:pPr>
+        <w:spacing w:after="0" w:line="240" w:lineRule="auto"/>
+      </w:pPr>
+      <w:r>
+        <w:separator/>
+      </w:r>
+    </w:p>
+  </w:endnote>
+  <w:endnote w:type="continuationSeparator" w:id="0">
+    <w:p>
+      <w:pPr>
+        <w:spacing w:after="0" w:line="240" w:lineRule="auto"/>
+      </w:pPr>
+      <w:r>
+        <w:continuationSeparator/>
+      </w:r>
+    </w:p>
+  </w:endnote>
+</w:endnotes>
+</file>
+
+<file path=word/footnotes.xml><?xml version="1.0" encoding="utf-8"?>
+<w:footnotes xmlns:wpc="http://schemas.microsoft.com/office/word/2010/wordprocessingCanvas" xmlns:cx="http://schemas.microsoft.com/office/drawing/2014/chartex" xmlns:cx1="http://schemas.microsoft.com/office/drawing/2015/9/8/chartex" xmlns:cx2="http://schemas.microsoft.com/office/drawing/2015/10/21/chartex" xmlns:cx3="http://schemas.microsoft.com/office/drawing/2016/5/9/chartex" xmlns:cx4="http://schemas.microsoft.com/office/drawing/2016/5/10/chartex" xmlns:cx5="http://schemas.microsoft.com/office/drawing/2016/5/11/chartex" xmlns:cx6="http://schemas.microsoft.com/office/drawing/2016/5/12/chartex" xmlns:cx7="http://schemas.microsoft.com/office/drawing/2016/5/13/chartex" xmlns:cx8="http://schemas.microsoft.com/office/drawing/2016/5/14/chartex" xmlns:mc="http://schemas.openxmlformats.org/markup-compatibility/2006" xmlns:aink="http://schemas.microsoft.com/office/drawing/2016/ink" xmlns:am3d="http://schemas.microsoft.com/office/drawing/2017/model3d" xmlns:o="urn:schemas-microsoft-com:office:office" xmlns:oel="http://schemas.microsoft.com/office/2019/extlst" xmlns:r="http://schemas.openxmlformats.org/officeDocument/2006/relationships" xmlns:m="http://schemas.openxmlformats.org/officeDocument/2006/math" xmlns:v="urn:schemas-microsoft-com:vml" xmlns:wp14="http://schemas.microsoft.com/office/word/2010/wordprocessingDrawing" xmlns:wp="http://schemas.openxmlformats.org/drawingml/2006/wordprocessingDrawing" xmlns:w10="urn:schemas-microsoft-com:office:word" xmlns:w="http://schemas.openxmlformats.org/wordprocessingml/2006/main" xmlns:w14="http://schemas.microsoft.com/office/word/2010/wordml" xmlns:w15="http://schemas.microsoft.com/office/word/2012/wordml" xmlns:w16cex="http://schemas.microsoft.com/office/word/2018/wordml/cex" xmlns:w16cid="http://schemas.microsoft.com/office/word/2016/wordml/cid" xmlns:w16="http://schemas.microsoft.com/office/word/2018/wordml" xmlns:w16du="http://schemas.microsoft.com/office/word/2023/wordml/word16du" xmlns:w16sdtdh="http://schemas.microsoft.com/office/word/2020/wordml/sdtdatahash" xmlns:w16sdtfl="http://schemas.microsoft.com/office/word/2024/wordml/sdtformatlock" xmlns:w16se="http://schemas.microsoft.com/office/word/2015/wordml/symex" xmlns:wpg="http://schemas.microsoft.com/office/word/2010/wordprocessingGroup" xmlns:wpi="http://schemas.microsoft.com/office/word/2010/wordprocessingInk" xmlns:wne="http://schemas.microsoft.com/office/word/2006/wordml" xmlns:wps="http://schemas.microsoft.com/office/word/2010/wordprocessingShape" mc:Ignorable="w14 w15 w16se w16cid w16 w16cex w16sdtdh w16sdtfl w16du wp14">
+  <w:footnote w:type="separator" w:id="-1">
+    <w:p>
+      <w:pPr>
+        <w:spacing w:after="0" w:line="240" w:lineRule="auto"/>
+      </w:pPr>
+      <w:r>
+        <w:separator/>
+      </w:r>
+    </w:p>
+  </w:footnote>
+  <w:footnote w:type="continuationSeparator" w:id="0">
+    <w:p>
+      <w:pPr>
+        <w:spacing w:after="0" w:line="240" w:lineRule="auto"/>
+      </w:pPr>
+      <w:r>
+        <w:continuationSeparator/>
+      </w:r>
+    </w:p>
+  </w:footnote>
+</w:footnotes>
 </file>
 
 <file path=word/styles.xml><?xml version="1.0" encoding="utf-8"?>
@@ -6589,6 +6774,7 @@
   <w:style w:type="character" w:default="1" w:styleId="a0">
     <w:name w:val="Default Paragraph Font"/>
     <w:uiPriority w:val="1"/>
+    <w:semiHidden/>
     <w:unhideWhenUsed/>
   </w:style>
   <w:style w:type="table" w:default="1" w:styleId="a1">
@@ -6640,6 +6826,70 @@
     <w:rPr>
       <w:color w:val="0563C1" w:themeColor="hyperlink"/>
       <w:u w:val="single"/>
+    </w:rPr>
+  </w:style>
+  <w:style w:type="character" w:styleId="a5">
+    <w:name w:val="Unresolved Mention"/>
+    <w:basedOn w:val="a0"/>
+    <w:uiPriority w:val="99"/>
+    <w:semiHidden/>
+    <w:unhideWhenUsed/>
+    <w:rsid w:val="00C414C1"/>
+    <w:rPr>
+      <w:color w:val="605E5C"/>
+      <w:shd w:val="clear" w:color="auto" w:fill="E1DFDD"/>
+    </w:rPr>
+  </w:style>
+  <w:style w:type="paragraph" w:styleId="a6">
+    <w:name w:val="header"/>
+    <w:basedOn w:val="a"/>
+    <w:link w:val="a7"/>
+    <w:uiPriority w:val="99"/>
+    <w:unhideWhenUsed/>
+    <w:rsid w:val="00C414C1"/>
+    <w:pPr>
+      <w:tabs>
+        <w:tab w:val="center" w:pos="4677"/>
+        <w:tab w:val="right" w:pos="9355"/>
+      </w:tabs>
+      <w:spacing w:after="0" w:line="240" w:lineRule="auto"/>
+    </w:pPr>
+  </w:style>
+  <w:style w:type="character" w:customStyle="1" w:styleId="a7">
+    <w:name w:val="Верхний колонтитул Знак"/>
+    <w:basedOn w:val="a0"/>
+    <w:link w:val="a6"/>
+    <w:uiPriority w:val="99"/>
+    <w:rsid w:val="00C414C1"/>
+    <w:rPr>
+      <w:rFonts w:ascii="Times New Roman" w:hAnsi="Times New Roman"/>
+      <w:sz w:val="28"/>
+    </w:rPr>
+  </w:style>
+  <w:style w:type="paragraph" w:styleId="a8">
+    <w:name w:val="footer"/>
+    <w:basedOn w:val="a"/>
+    <w:link w:val="a9"/>
+    <w:uiPriority w:val="99"/>
+    <w:unhideWhenUsed/>
+    <w:rsid w:val="00C414C1"/>
+    <w:pPr>
+      <w:tabs>
+        <w:tab w:val="center" w:pos="4677"/>
+        <w:tab w:val="right" w:pos="9355"/>
+      </w:tabs>
+      <w:spacing w:after="0" w:line="240" w:lineRule="auto"/>
+    </w:pPr>
+  </w:style>
+  <w:style w:type="character" w:customStyle="1" w:styleId="a9">
+    <w:name w:val="Нижний колонтитул Знак"/>
+    <w:basedOn w:val="a0"/>
+    <w:link w:val="a8"/>
+    <w:uiPriority w:val="99"/>
+    <w:rsid w:val="00C414C1"/>
+    <w:rPr>
+      <w:rFonts w:ascii="Times New Roman" w:hAnsi="Times New Roman"/>
+      <w:sz w:val="28"/>
     </w:rPr>
   </w:style>
 </w:styles>

</xml_diff>